<commit_message>
fixed and added quizzes
</commit_message>
<xml_diff>
--- a/docs/common_code/16_functions/functions.docx
+++ b/docs/common_code/16_functions/functions.docx
@@ -48,19 +48,7 @@
         <w:pStyle w:val="FirstParagraph"/>
       </w:pPr>
       <w:r>
-        <w:t xml:space="preserve">If you copy-paste the same block of code more than twice, write a function.</w:t>
-      </w:r>
-      <w:r>
-        <w:t xml:space="preserve"> </w:t>
-      </w:r>
-      <w:r>
-        <w:t xml:space="preserve">Functions reduce errors, make your intent clear, and let you update logic in</w:t>
-      </w:r>
-      <w:r>
-        <w:t xml:space="preserve"> </w:t>
-      </w:r>
-      <w:r>
-        <w:t xml:space="preserve">one place rather than hunting through twenty scripts.</w:t>
+        <w:t xml:space="preserve">If you copy-paste the same block of code more than twice, write a function. Functions reduce errors, make your intent clear, and let you update logic in one place rather than hunting through twenty scripts.</w:t>
       </w:r>
     </w:p>
     <w:p>
@@ -441,13 +429,7 @@
               <w:spacing w:before="16" w:after="16"/>
             </w:pPr>
             <w:r>
-              <w:t xml:space="preserve">R automatically returns the last expression in the function body. Most</w:t>
-            </w:r>
-            <w:r>
-              <w:t xml:space="preserve"> </w:t>
-            </w:r>
-            <w:r>
-              <w:t xml:space="preserve">tidyverse-style functions omit</w:t>
+              <w:t xml:space="preserve">R automatically returns the last expression in the function body. Most tidyverse-style functions omit</w:t>
             </w:r>
             <w:r>
               <w:t xml:space="preserve"> </w:t>
@@ -462,13 +444,7 @@
               <w:t xml:space="preserve"> </w:t>
             </w:r>
             <w:r>
-              <w:t xml:space="preserve">and just end with the value they</w:t>
-            </w:r>
-            <w:r>
-              <w:t xml:space="preserve"> </w:t>
-            </w:r>
-            <w:r>
-              <w:t xml:space="preserve">want to return. Use</w:t>
+              <w:t xml:space="preserve">and just end with the value they want to return. Use</w:t>
             </w:r>
             <w:r>
               <w:t xml:space="preserve"> </w:t>
@@ -527,13 +503,7 @@
         <w:t xml:space="preserve"> </w:t>
       </w:r>
       <w:r>
-        <w:t xml:space="preserve">in every</w:t>
-      </w:r>
-      <w:r>
-        <w:t xml:space="preserve"> </w:t>
-      </w:r>
-      <w:r>
-        <w:t xml:space="preserve">script. Write it once:</w:t>
+        <w:t xml:space="preserve">in every script. Write it once:</w:t>
       </w:r>
     </w:p>
     <w:p>
@@ -2456,13 +2426,7 @@
               <w:t xml:space="preserve"> </w:t>
             </w:r>
             <w:r>
-              <w:t xml:space="preserve">to</w:t>
-            </w:r>
-            <w:r>
-              <w:t xml:space="preserve"> </w:t>
-            </w:r>
-            <w:r>
-              <w:t xml:space="preserve">tell ggplot to look up the column whose name is stored in</w:t>
+              <w:t xml:space="preserve">to tell ggplot to look up the column whose name is stored in</w:t>
             </w:r>
             <w:r>
               <w:t xml:space="preserve"> </w:t>
@@ -3058,13 +3022,7 @@
               <w:t xml:space="preserve"> </w:t>
             </w:r>
             <w:r>
-              <w:t xml:space="preserve">prevents R from printing the internal function call</w:t>
-            </w:r>
-            <w:r>
-              <w:t xml:space="preserve"> </w:t>
-            </w:r>
-            <w:r>
-              <w:t xml:space="preserve">in the error message — the output is cleaner and more user-friendly.</w:t>
+              <w:t xml:space="preserve">prevents R from printing the internal function call in the error message — the output is cleaner and more user-friendly.</w:t>
             </w:r>
           </w:p>
           <w:p/>

</xml_diff>